<commit_message>
Reframe the project as an independent case study
Co-Authored-By: Claude Opus 5.5 (1M context) <noreply@anthropic.com>
</commit_message>
<xml_diff>
--- a/docs/DECISIONS.docx
+++ b/docs/DECISIONS.docx
@@ -546,7 +546,7 @@
         <w:t xml:space="preserve"> </w:t>
       </w:r>
       <w:r>
-        <w:t xml:space="preserve">conclusion, which is the one thing the brief forbids by name.</w:t>
+        <w:t xml:space="preserve">conclusion, which is exactly the shortcut this project rules out.</w:t>
       </w:r>
       <w:r>
         <w:t xml:space="preserve"> </w:t>
@@ -672,7 +672,7 @@
         <w:t xml:space="preserve"> </w:t>
       </w:r>
       <w:r>
-        <w:t xml:space="preserve">with, because it is the brief's own question: what does it show the buyer when</w:t>
+        <w:t xml:space="preserve">with, because it is the central question: what does it show the buyer when</w:t>
       </w:r>
       <w:r>
         <w:t xml:space="preserve"> </w:t>
@@ -876,7 +876,7 @@
         <w:t xml:space="preserve"> </w:t>
       </w:r>
       <w:r>
-        <w:t xml:space="preserve">Stubbed, as the brief permits, because the plumbing</w:t>
+        <w:t xml:space="preserve">Stubbed by design, because the plumbing</w:t>
       </w:r>
       <w:r>
         <w:t xml:space="preserve"> </w:t>
@@ -1026,7 +1026,7 @@
         <w:t xml:space="preserve"> </w:t>
       </w:r>
       <w:r>
-        <w:t xml:space="preserve">enquiry, so it lost to work the interviewer will actually see.</w:t>
+        <w:t xml:space="preserve">enquiry, so it lost to work every user will actually see.</w:t>
       </w:r>
     </w:p>
     <w:p>
@@ -1048,13 +1048,13 @@
         <w:t xml:space="preserve"> </w:t>
       </w:r>
       <w:r>
-        <w:t xml:space="preserve">Tested at 30 lines and 5 replies, not 300 and 30. The brief asked</w:t>
-      </w:r>
-      <w:r>
-        <w:t xml:space="preserve"> </w:t>
-      </w:r>
-      <w:r>
-        <w:t xml:space="preserve">for the size where it hurts, and that size is about judgement, not volume.</w:t>
+        <w:t xml:space="preserve">Tested at 30 lines and 5 replies, not 300 and 30. The scope was</w:t>
+      </w:r>
+      <w:r>
+        <w:t xml:space="preserve"> </w:t>
+      </w:r>
+      <w:r>
+        <w:t xml:space="preserve">the size where it hurts, and that size is about judgement, not volume.</w:t>
       </w:r>
     </w:p>
     <w:p>

</xml_diff>

<commit_message>
Match the app's page references to the source PDF and rebuild the doc renders
- Cygnus footnote is on page 3 and the 88.4 rate on page 2: fix catalog.json, generators and ground truth
- Rebuild WHAT-I-BUILT and DECISIONS docx/pdf
- PRD wording and cost-estimate labels; cost-model reference by function name

Co-Authored-By: Claude Opus 5.5 (1M context) <noreply@anthropic.com>
</commit_message>
<xml_diff>
--- a/docs/DECISIONS.docx
+++ b/docs/DECISIONS.docx
@@ -55,13 +55,13 @@
         <w:t xml:space="preserve"> </w:t>
       </w:r>
       <w:r>
-        <w:t xml:space="preserve">because it has the most unit traps of the four</w:t>
-      </w:r>
-      <w:r>
-        <w:t xml:space="preserve"> </w:t>
-      </w:r>
-      <w:r>
-        <w:t xml:space="preserve">categories offered: kits, boxes of 10, boxes of 50, per-piece, per-DIMM. A unit</w:t>
+        <w:t xml:space="preserve">because it has the most unit traps of the</w:t>
+      </w:r>
+      <w:r>
+        <w:t xml:space="preserve"> </w:t>
+      </w:r>
+      <w:r>
+        <w:t xml:space="preserve">categories I considered: kits, boxes of 10, boxes of 50, per-piece, per-DIMM. A unit</w:t>
       </w:r>
       <w:r>
         <w:t xml:space="preserve"> </w:t>

</xml_diff>

<commit_message>
Add why-AI section and PRD metrics; correct stale doc figures (#2)
* Add why-AI section and PRD metrics; correct stale figures in the docs

- README: live demo note and a why-AI-here, why-code-there table
- PRD: north-star target, supporting metrics and cost-per-task estimates from the cost model
- Fix moved line references, page numbers and live figures in AI-MAP, WHAT-I-BUILT, DECISIONS, DECISION-LOG and RFX-SETS

Co-Authored-By: Claude Opus 5.5 (1M context) <noreply@anthropic.com>

* Match the app's page references to the source PDF and rebuild the doc renders

- Cygnus footnote is on page 3 and the 88.4 rate on page 2: fix catalog.json, generators and ground truth
- Rebuild WHAT-I-BUILT and DECISIONS docx/pdf
- PRD wording and cost-estimate labels; cost-model reference by function name

Co-Authored-By: Claude Opus 5.5 (1M context) <noreply@anthropic.com>

---------

Co-authored-by: Claude Opus 5.5 (1M context) <noreply@anthropic.com>
</commit_message>
<xml_diff>
--- a/docs/DECISIONS.docx
+++ b/docs/DECISIONS.docx
@@ -55,13 +55,13 @@
         <w:t xml:space="preserve"> </w:t>
       </w:r>
       <w:r>
-        <w:t xml:space="preserve">because it has the most unit traps of the four</w:t>
-      </w:r>
-      <w:r>
-        <w:t xml:space="preserve"> </w:t>
-      </w:r>
-      <w:r>
-        <w:t xml:space="preserve">categories offered: kits, boxes of 10, boxes of 50, per-piece, per-DIMM. A unit</w:t>
+        <w:t xml:space="preserve">because it has the most unit traps of the</w:t>
+      </w:r>
+      <w:r>
+        <w:t xml:space="preserve"> </w:t>
+      </w:r>
+      <w:r>
+        <w:t xml:space="preserve">categories I considered: kits, boxes of 10, boxes of 50, per-piece, per-DIMM. A unit</w:t>
       </w:r>
       <w:r>
         <w:t xml:space="preserve"> </w:t>

</xml_diff>